<commit_message>
Add international CV and job search materials
- Generate international CV variants (EN/FR, PDF + DOCX) without
  Gulf-specific header details, built from the same CV data
- Serve the international CVs from the portfolio's Download CV button
- Add job tracker (Gulf employers and recruiters) and reusable
  application email / LinkedIn templates
- Build script now builds every CV variant and keeps temp files out
  of the repo

Co-Authored-By: Claude Opus 5.5 <noreply@anthropic.com>
</commit_message>
<xml_diff>
--- a/cv/Iyed_Khouildi_Developpeur_Full_Stack_CV_FR.docx
+++ b/cv/Iyed_Khouildi_Developpeur_Full_Stack_CV_FR.docx
@@ -40,7 +40,7 @@
         <w:spacing w:after="20"/>
         <w:jc w:val="center"/>
       </w:pPr>
-      <w:hyperlink w:history="1" r:id="rIdmpwgpz_5uuiv_d0sooj2o">
+      <w:hyperlink w:history="1" r:id="rId77o7jzvmtreblmoayahn5">
         <w:r>
           <w:rPr>
             <w:sz w:val="19"/>
@@ -77,7 +77,7 @@
         </w:rPr>
         <w:t xml:space="preserve">  |  </w:t>
       </w:r>
-      <w:hyperlink w:history="1" r:id="rIdtilt01f-_0swc7fqzzcgp">
+      <w:hyperlink w:history="1" r:id="rIdlh8g0ktqog5cvh7lbcgpv">
         <w:r>
           <w:rPr>
             <w:sz w:val="19"/>
@@ -97,7 +97,7 @@
         </w:rPr>
         <w:t xml:space="preserve">  |  </w:t>
       </w:r>
-      <w:hyperlink w:history="1" r:id="rIday0lgy4db8bl2lmblrsbi">
+      <w:hyperlink w:history="1" r:id="rId9hnt-xmllsggjs8j9vwfl">
         <w:r>
           <w:rPr>
             <w:sz w:val="19"/>
@@ -117,7 +117,7 @@
         </w:rPr>
         <w:t xml:space="preserve">  |  </w:t>
       </w:r>
-      <w:hyperlink w:history="1" r:id="rIdyndlt84mjyz7uuj1ujfan">
+      <w:hyperlink w:history="1" r:id="rIdkdwnd-qtuwu3lttigzoub">
         <w:r>
           <w:rPr>
             <w:sz w:val="19"/>

</xml_diff>

<commit_message>
Add data science CV (EN/FR) and offer it on the portfolio
- Build Data Scientist CV variants from the shared CV data, with a
  Machine Learning & AI training section and data-focused experience
- CV window now offers Full Stack and Data Science CVs in English and
  French, with labels in all three site languages
- Make the CV window scroll when it is taller than the screen

Co-Authored-By: Claude Opus 5.5 <noreply@anthropic.com>
</commit_message>
<xml_diff>
--- a/cv/Iyed_Khouildi_Developpeur_Full_Stack_CV_FR.docx
+++ b/cv/Iyed_Khouildi_Developpeur_Full_Stack_CV_FR.docx
@@ -40,7 +40,7 @@
         <w:spacing w:after="20"/>
         <w:jc w:val="center"/>
       </w:pPr>
-      <w:hyperlink w:history="1" r:id="rId77o7jzvmtreblmoayahn5">
+      <w:hyperlink w:history="1" r:id="rId8hit8fhxak39slcej5buw">
         <w:r>
           <w:rPr>
             <w:sz w:val="19"/>
@@ -77,7 +77,7 @@
         </w:rPr>
         <w:t xml:space="preserve">  |  </w:t>
       </w:r>
-      <w:hyperlink w:history="1" r:id="rIdlh8g0ktqog5cvh7lbcgpv">
+      <w:hyperlink w:history="1" r:id="rId-jjf6bg2pfegvq6jvg30h">
         <w:r>
           <w:rPr>
             <w:sz w:val="19"/>
@@ -97,7 +97,7 @@
         </w:rPr>
         <w:t xml:space="preserve">  |  </w:t>
       </w:r>
-      <w:hyperlink w:history="1" r:id="rId9hnt-xmllsggjs8j9vwfl">
+      <w:hyperlink w:history="1" r:id="rIdbs5kq-lo7roxztq2mout1">
         <w:r>
           <w:rPr>
             <w:sz w:val="19"/>
@@ -117,7 +117,7 @@
         </w:rPr>
         <w:t xml:space="preserve">  |  </w:t>
       </w:r>
-      <w:hyperlink w:history="1" r:id="rIdkdwnd-qtuwu3lttigzoub">
+      <w:hyperlink w:history="1" r:id="rIdivzn57k8mlshcktfg-wov">
         <w:r>
           <w:rPr>
             <w:sz w:val="19"/>

</xml_diff>